<commit_message>
Actualiza subtítulo del informe desafíos analíticos
</commit_message>
<xml_diff>
--- a/DESAFÍOS ÉTICOS.docx
+++ b/DESAFÍOS ÉTICOS.docx
@@ -287,31 +287,7 @@
         <w:rPr>
           <w:lang w:val="es-MX"/>
         </w:rPr>
-        <w:t xml:space="preserve">con una enfermedad que merme su capacidad de consentimiento pleno o sea influenciado por las expectativas de seres queridos. </w:t>
-      </w:r>
-      <w:r>
-        <w:rPr>
-          <w:lang w:val="es-MX"/>
-        </w:rPr>
-        <w:t>En segundo lugar, el principio de benefic</w:t>
-      </w:r>
-      <w:r>
-        <w:rPr>
-          <w:lang w:val="es-MX"/>
-        </w:rPr>
-        <w:t>encia</w:t>
-      </w:r>
-      <w:r>
-        <w:rPr>
-          <w:lang w:val="es-MX"/>
-        </w:rPr>
-        <w:t>.</w:t>
-      </w:r>
-      <w:r>
-        <w:rPr>
-          <w:lang w:val="es-MX"/>
-        </w:rPr>
-        <w:t xml:space="preserve"> La aplicación de estos dispositivos no se encuentra libre de riesgos inherentes </w:t>
+        <w:t xml:space="preserve">con una enfermedad que merme su capacidad de consentimiento pleno o sea influenciado por las expectativas de seres queridos. En segundo lugar, el principio de beneficencia. La aplicación de estos dispositivos no se encuentra libre de riesgos inherentes </w:t>
       </w:r>
       <w:r>
         <w:rPr>
@@ -371,19 +347,7 @@
         <w:rPr>
           <w:lang w:val="es-MX"/>
         </w:rPr>
-        <w:t xml:space="preserve"> los potenciales efectos a medio y largo plazo, incluyendo la calidad de la señal, longevidad del dispositivo y la experiencia del usuario. </w:t>
-      </w:r>
-      <w:r>
-        <w:rPr>
-          <w:lang w:val="es-MX"/>
-        </w:rPr>
-        <w:t>Además,</w:t>
-      </w:r>
-      <w:r>
-        <w:rPr>
-          <w:lang w:val="es-MX"/>
-        </w:rPr>
-        <w:t xml:space="preserve"> la probabilidad de extracción o reemplazo del dispositivo y los riesgos asociados a la intervención</w:t>
+        <w:t xml:space="preserve"> los potenciales efectos a medio y largo plazo, incluyendo la calidad de la señal, longevidad del dispositivo y la experiencia del usuario. Además, la probabilidad de extracción o reemplazo del dispositivo y los riesgos asociados a la intervención</w:t>
       </w:r>
       <w:r>
         <w:rPr>
@@ -449,50 +413,14 @@
         <w:rPr>
           <w:lang w:val="es-MX"/>
         </w:rPr>
-        <w:t xml:space="preserve">Este principio pone en tela de juicio la posible accesibilidad que tenga este tipo de </w:t>
-      </w:r>
-      <w:r>
-        <w:rPr>
-          <w:lang w:val="es-MX"/>
-        </w:rPr>
-        <w:t>tecnología</w:t>
-      </w:r>
-      <w:r>
-        <w:rPr>
-          <w:lang w:val="es-MX"/>
-        </w:rPr>
-        <w:t xml:space="preserve"> y evitar </w:t>
-      </w:r>
-      <w:r>
-        <w:rPr>
-          <w:lang w:val="es-MX"/>
-        </w:rPr>
-        <w:t>exacerbar</w:t>
-      </w:r>
-      <w:r>
-        <w:rPr>
-          <w:lang w:val="es-MX"/>
-        </w:rPr>
-        <w:t xml:space="preserve"> brechas médicas ya existentes. Entre centros de investigación privados y pacientes con los recursos </w:t>
+        <w:t xml:space="preserve">Este principio pone en tela de juicio la posible accesibilidad que tenga este tipo de tecnología y evitar exacerbar brechas médicas ya existentes. Entre centros de investigación privados y pacientes con los recursos </w:t>
       </w:r>
       <w:r>
         <w:rPr>
           <w:lang w:val="es-MX"/>
         </w:rPr>
         <w:lastRenderedPageBreak/>
-        <w:t xml:space="preserve">económicos para </w:t>
-      </w:r>
-      <w:r>
-        <w:rPr>
-          <w:lang w:val="es-MX"/>
-        </w:rPr>
-        <w:t>permitírselos</w:t>
-      </w:r>
-      <w:r>
-        <w:rPr>
-          <w:lang w:val="es-MX"/>
-        </w:rPr>
-        <w:t xml:space="preserve">, </w:t>
+        <w:t xml:space="preserve">económicos para permitírselos, </w:t>
       </w:r>
       <w:r>
         <w:rPr>
@@ -504,49 +432,13 @@
         <w:rPr>
           <w:lang w:val="es-MX"/>
         </w:rPr>
-        <w:t xml:space="preserve">se debe tomar en cuenta quien se beneficia del desarrollo e </w:t>
-      </w:r>
-      <w:r>
-        <w:rPr>
-          <w:lang w:val="es-MX"/>
-        </w:rPr>
-        <w:t>implementación</w:t>
-      </w:r>
-      <w:r>
-        <w:rPr>
-          <w:lang w:val="es-MX"/>
-        </w:rPr>
-        <w:t xml:space="preserve"> de esta </w:t>
-      </w:r>
-      <w:r>
-        <w:rPr>
-          <w:lang w:val="es-MX"/>
-        </w:rPr>
-        <w:t>tecnología</w:t>
-      </w:r>
-      <w:r>
-        <w:rPr>
-          <w:lang w:val="es-MX"/>
-        </w:rPr>
-        <w:t>, y quien participa en su diseño y aplicación</w:t>
-      </w:r>
-      <w:r>
-        <w:rPr>
-          <w:lang w:val="es-MX"/>
-        </w:rPr>
-        <w:t xml:space="preserve"> </w:t>
-      </w:r>
-      <w:r>
-        <w:rPr>
-          <w:lang w:val="es-MX"/>
-        </w:rPr>
-        <w:t>(Becerra, 2025)</w:t>
-      </w:r>
-      <w:r>
-        <w:rPr>
-          <w:lang w:val="es-MX"/>
-        </w:rPr>
-        <w:t>. Por estos motivos, un campo tan novedoso como el BCI presenta una serie de principios bioéticos ligados a su empleo y funcionamiento con el cerebro.</w:t>
+        <w:t>se debe tomar en cuenta quien se beneficia del desarrollo e implementación de esta tecnología, y quien participa en su diseño y aplicación</w:t>
+      </w:r>
+      <w:r>
+        <w:rPr>
+          <w:lang w:val="es-MX"/>
+        </w:rPr>
+        <w:t xml:space="preserve"> (Becerra, 2025). Por estos motivos, un campo tan novedoso como el BCI presenta una serie de principios bioéticos ligados a su empleo y funcionamiento con el cerebro.</w:t>
       </w:r>
     </w:p>
     <w:p>
@@ -581,19 +473,7 @@
         <w:rPr>
           <w:lang w:val="es-MX"/>
         </w:rPr>
-        <w:t>ra</w:t>
-      </w:r>
-      <w:r>
-        <w:rPr>
-          <w:lang w:val="es-MX"/>
-        </w:rPr>
-        <w:t xml:space="preserve"> (</w:t>
-      </w:r>
-      <w:r>
-        <w:rPr>
-          <w:lang w:val="es-MX"/>
-        </w:rPr>
-        <w:t>2025)</w:t>
+        <w:t>ra (2025)</w:t>
       </w:r>
     </w:p>
     <w:p>
@@ -617,6 +497,7 @@
         </w:rPr>
         <w:t xml:space="preserve"> </w:t>
       </w:r>
+      <w:proofErr w:type="spellStart"/>
       <w:r>
         <w:rPr>
           <w:lang w:val="es-MX"/>
@@ -635,23 +516,12 @@
         </w:rPr>
         <w:t>rcia</w:t>
       </w:r>
-      <w:r>
-        <w:rPr>
-          <w:lang w:val="es-MX"/>
-        </w:rPr>
-        <w:t xml:space="preserve"> (</w:t>
-      </w:r>
-      <w:r>
-        <w:rPr>
-          <w:lang w:val="es-MX"/>
-        </w:rPr>
-        <w:t>2006</w:t>
-      </w:r>
-      <w:r>
-        <w:rPr>
-          <w:lang w:val="es-MX"/>
-        </w:rPr>
-        <w:t>)</w:t>
+      <w:proofErr w:type="spellEnd"/>
+      <w:r>
+        <w:rPr>
+          <w:lang w:val="es-MX"/>
+        </w:rPr>
+        <w:t xml:space="preserve"> (2006)</w:t>
       </w:r>
     </w:p>
     <w:p>
@@ -673,13 +543,27 @@
         <w:rPr>
           <w:lang w:val="es-MX"/>
         </w:rPr>
-        <w:t xml:space="preserve"> Mací</w:t>
-      </w:r>
-      <w:r>
-        <w:rPr>
-          <w:lang w:val="es-MX"/>
-        </w:rPr>
-        <w:t>a (2026)</w:t>
+        <w:t xml:space="preserve"> </w:t>
+      </w:r>
+      <w:proofErr w:type="spellStart"/>
+      <w:r>
+        <w:rPr>
+          <w:lang w:val="es-MX"/>
+        </w:rPr>
+        <w:t>Mací</w:t>
+      </w:r>
+      <w:r>
+        <w:rPr>
+          <w:lang w:val="es-MX"/>
+        </w:rPr>
+        <w:t>a</w:t>
+      </w:r>
+      <w:proofErr w:type="spellEnd"/>
+      <w:r>
+        <w:rPr>
+          <w:lang w:val="es-MX"/>
+        </w:rPr>
+        <w:t xml:space="preserve"> (2026)</w:t>
       </w:r>
     </w:p>
     <w:p>
@@ -701,13 +585,27 @@
         <w:rPr>
           <w:lang w:val="es-MX"/>
         </w:rPr>
-        <w:t xml:space="preserve"> Lava</w:t>
-      </w:r>
-      <w:r>
-        <w:rPr>
-          <w:lang w:val="es-MX"/>
-        </w:rPr>
-        <w:t>zza (2025)</w:t>
+        <w:t xml:space="preserve"> </w:t>
+      </w:r>
+      <w:proofErr w:type="spellStart"/>
+      <w:r>
+        <w:rPr>
+          <w:lang w:val="es-MX"/>
+        </w:rPr>
+        <w:t>Lava</w:t>
+      </w:r>
+      <w:r>
+        <w:rPr>
+          <w:lang w:val="es-MX"/>
+        </w:rPr>
+        <w:t>zza</w:t>
+      </w:r>
+      <w:proofErr w:type="spellEnd"/>
+      <w:r>
+        <w:rPr>
+          <w:lang w:val="es-MX"/>
+        </w:rPr>
+        <w:t xml:space="preserve"> (2025)</w:t>
       </w:r>
     </w:p>
     <w:p>
@@ -834,285 +732,800 @@
       </w:r>
     </w:p>
     <w:p>
+      <w:pPr>
+        <w:rPr>
+          <w:lang w:val="es-MX"/>
+        </w:rPr>
+      </w:pPr>
       <w:hyperlink r:id="rId9" w:history="1">
         <w:r>
           <w:rPr>
             <w:rStyle w:val="Hyperlink"/>
+            <w:lang w:val="es-MX"/>
           </w:rPr>
           <w:t>https://dialnet.unirioja.es/servlet/articulo?codigo=8724142</w:t>
         </w:r>
       </w:hyperlink>
       <w:r>
-        <w:t xml:space="preserve"> Alon</w:t>
-      </w:r>
-      <w:r>
-        <w:t>so (2022)</w:t>
-      </w:r>
-    </w:p>
-    <w:p>
-      <w:pPr>
-        <w:rPr>
-          <w:lang w:val="es-MX"/>
-        </w:rPr>
-      </w:pPr>
-      <w:r>
+        <w:rPr>
+          <w:lang w:val="es-MX"/>
+        </w:rPr>
+        <w:t xml:space="preserve"> Alonso (2022)</w:t>
+      </w:r>
+    </w:p>
+    <w:p>
+      <w:pPr>
+        <w:rPr>
+          <w:lang w:val="es-MX"/>
+        </w:rPr>
+      </w:pPr>
+      <w:r>
+        <w:rPr>
+          <w:lang w:val="es-MX"/>
+        </w:rPr>
         <w:br w:type="page"/>
       </w:r>
-      <w:r>
+    </w:p>
+    <w:p>
+      <w:pPr>
+        <w:rPr>
+          <w:lang w:val="es-MX"/>
+        </w:rPr>
+      </w:pPr>
+      <w:r>
+        <w:rPr>
+          <w:lang w:val="es-MX"/>
+        </w:rPr>
+        <w:lastRenderedPageBreak/>
+        <w:t>NEURODERECHOS</w:t>
+      </w:r>
+    </w:p>
+    <w:p>
+      <w:pPr>
+        <w:rPr>
+          <w:lang w:val="es-MX"/>
+        </w:rPr>
+      </w:pPr>
+      <w:r>
+        <w:rPr>
+          <w:lang w:val="es-MX"/>
+        </w:rPr>
+        <w:t>En el momento de introducir una tecnología disruptiva como la BCI, surgen nuevos desafíos y peligros debido a que abren una puerta a la intervención directa a nuestro cerebro. Por este motivo, e</w:t>
+      </w:r>
+      <w:r>
+        <w:rPr>
+          <w:lang w:val="es-MX"/>
+        </w:rPr>
+        <w:t xml:space="preserve">stas nuevas amenazas </w:t>
+      </w:r>
+      <w:r>
+        <w:rPr>
+          <w:lang w:val="es-MX"/>
+        </w:rPr>
+        <w:t>urgen</w:t>
+      </w:r>
+      <w:r>
+        <w:rPr>
+          <w:lang w:val="es-MX"/>
+        </w:rPr>
+        <w:t xml:space="preserve"> una actualización de los derechos humanos entendidos desde una</w:t>
+      </w:r>
+      <w:r>
+        <w:rPr>
+          <w:lang w:val="es-MX"/>
+        </w:rPr>
+        <w:t xml:space="preserve"> </w:t>
+      </w:r>
+      <w:r>
+        <w:rPr>
+          <w:lang w:val="es-MX"/>
+        </w:rPr>
+        <w:t xml:space="preserve">perspectiva evolutiva y </w:t>
+      </w:r>
+      <w:r>
+        <w:rPr>
+          <w:lang w:val="es-MX"/>
+        </w:rPr>
+        <w:t>adaptarlos</w:t>
+      </w:r>
+      <w:r>
+        <w:rPr>
+          <w:lang w:val="es-MX"/>
+        </w:rPr>
+        <w:t xml:space="preserve"> a la nueva realidad tecnocientífica</w:t>
+      </w:r>
+      <w:r>
+        <w:rPr>
+          <w:lang w:val="es-MX"/>
+        </w:rPr>
+        <w:t xml:space="preserve"> </w:t>
+      </w:r>
+      <w:r>
+        <w:rPr>
+          <w:lang w:val="es-MX"/>
+        </w:rPr>
+        <w:t>(</w:t>
+      </w:r>
+      <w:proofErr w:type="spellStart"/>
+      <w:r>
+        <w:rPr>
+          <w:lang w:val="es-MX"/>
+        </w:rPr>
+        <w:t>Ausín</w:t>
+      </w:r>
+      <w:proofErr w:type="spellEnd"/>
+      <w:r>
+        <w:rPr>
+          <w:lang w:val="es-MX"/>
+        </w:rPr>
+        <w:t xml:space="preserve"> et al.</w:t>
+      </w:r>
+      <w:r>
+        <w:rPr>
+          <w:lang w:val="es-MX"/>
+        </w:rPr>
+        <w:t xml:space="preserve"> 2020). En esta línea, </w:t>
+      </w:r>
+      <w:r>
+        <w:rPr>
+          <w:lang w:val="es-MX"/>
+        </w:rPr>
+        <w:t>Yuste</w:t>
+      </w:r>
+      <w:r>
+        <w:rPr>
+          <w:lang w:val="es-MX"/>
+        </w:rPr>
+        <w:t xml:space="preserve"> (2017) define cuatro preocupaciones con r</w:t>
+      </w:r>
+      <w:r>
+        <w:rPr>
+          <w:lang w:val="es-MX"/>
+        </w:rPr>
+        <w:t xml:space="preserve">especto a las nuevas </w:t>
+      </w:r>
+      <w:proofErr w:type="spellStart"/>
+      <w:r>
+        <w:rPr>
+          <w:lang w:val="es-MX"/>
+        </w:rPr>
+        <w:t>neurotecnologías</w:t>
+      </w:r>
+      <w:proofErr w:type="spellEnd"/>
+      <w:r>
+        <w:rPr>
+          <w:lang w:val="es-MX"/>
+        </w:rPr>
+        <w:t xml:space="preserve"> emergentes:</w:t>
+      </w:r>
+    </w:p>
+    <w:p>
+      <w:pPr>
+        <w:rPr>
+          <w:lang w:val="es-MX"/>
+        </w:rPr>
+      </w:pPr>
+      <w:r>
+        <w:rPr>
+          <w:lang w:val="es-MX"/>
+        </w:rPr>
+        <w:t xml:space="preserve">i. Privacidad y consentimiento. Una extraordinaria cantidad de información personal puede ser obtenido </w:t>
+      </w:r>
+      <w:r>
+        <w:rPr>
+          <w:lang w:val="es-MX"/>
+        </w:rPr>
+        <w:t>a partir de los rastros de datos de las personas; por ello, se cree que los ciudadanos deben tener el derecho de mantener sus datos neuronales privados. Esta información puede ser susceptible a seguimiento o incluso manipulación por parte de corporaciones, hackers o agencias gubernamentales.</w:t>
+      </w:r>
+    </w:p>
+    <w:p>
+      <w:pPr>
+        <w:rPr>
+          <w:i/>
+          <w:iCs/>
+        </w:rPr>
+      </w:pPr>
+      <w:r>
+        <w:rPr>
+          <w:i/>
+          <w:iCs/>
+          <w:highlight w:val="yellow"/>
+        </w:rPr>
+        <w:t>Algorithms that are used to target advertising, calculate insurance premiums or</w:t>
+      </w:r>
+      <w:r>
+        <w:rPr>
+          <w:i/>
+          <w:iCs/>
+          <w:highlight w:val="yellow"/>
+        </w:rPr>
+        <w:t xml:space="preserve"> </w:t>
+      </w:r>
+      <w:r>
+        <w:rPr>
+          <w:i/>
+          <w:iCs/>
+          <w:highlight w:val="yellow"/>
+        </w:rPr>
+        <w:t>match potential</w:t>
+      </w:r>
+      <w:r>
+        <w:rPr>
+          <w:i/>
+          <w:iCs/>
+          <w:highlight w:val="yellow"/>
+        </w:rPr>
+        <w:t xml:space="preserve"> </w:t>
+      </w:r>
+      <w:r>
+        <w:rPr>
+          <w:i/>
+          <w:iCs/>
+          <w:highlight w:val="yellow"/>
+        </w:rPr>
+        <w:t>partners will be</w:t>
+      </w:r>
+      <w:r>
+        <w:rPr>
+          <w:i/>
+          <w:iCs/>
+          <w:highlight w:val="yellow"/>
+        </w:rPr>
+        <w:t xml:space="preserve"> </w:t>
+      </w:r>
+      <w:r>
+        <w:rPr>
+          <w:i/>
+          <w:iCs/>
+          <w:highlight w:val="yellow"/>
+        </w:rPr>
+        <w:t>considerably more</w:t>
+      </w:r>
+      <w:r>
+        <w:rPr>
+          <w:i/>
+          <w:iCs/>
+          <w:highlight w:val="yellow"/>
+        </w:rPr>
+        <w:t xml:space="preserve"> </w:t>
+      </w:r>
+      <w:r>
+        <w:rPr>
+          <w:i/>
+          <w:iCs/>
+          <w:highlight w:val="yellow"/>
+        </w:rPr>
+        <w:t>powerf</w:t>
+      </w:r>
+      <w:r>
+        <w:rPr>
+          <w:i/>
+          <w:iCs/>
+          <w:highlight w:val="yellow"/>
+        </w:rPr>
+        <w:t>ul</w:t>
+      </w:r>
+    </w:p>
+    <w:p>
+      <w:pPr>
+        <w:rPr>
+          <w:lang w:val="es-MX"/>
+        </w:rPr>
+      </w:pPr>
+      <w:proofErr w:type="spellStart"/>
+      <w:r>
+        <w:rPr>
+          <w:lang w:val="es-MX"/>
+        </w:rPr>
+        <w:t>ii</w:t>
+      </w:r>
+      <w:proofErr w:type="spellEnd"/>
+      <w:r>
+        <w:rPr>
+          <w:lang w:val="es-MX"/>
+        </w:rPr>
+        <w:t xml:space="preserve">. Agencia y </w:t>
+      </w:r>
+      <w:r>
+        <w:rPr>
+          <w:lang w:val="es-MX"/>
+        </w:rPr>
+        <w:t>identidad</w:t>
+      </w:r>
+      <w:r>
+        <w:rPr>
+          <w:lang w:val="es-MX"/>
+        </w:rPr>
+        <w:t>.  L</w:t>
+      </w:r>
+      <w:r>
+        <w:rPr>
+          <w:lang w:val="es-MX"/>
+        </w:rPr>
+        <w:t xml:space="preserve">as </w:t>
+      </w:r>
+      <w:proofErr w:type="spellStart"/>
+      <w:r>
+        <w:rPr>
+          <w:lang w:val="es-MX"/>
+        </w:rPr>
+        <w:t>neurotecnologías</w:t>
+      </w:r>
+      <w:proofErr w:type="spellEnd"/>
+      <w:r>
+        <w:rPr>
+          <w:lang w:val="es-MX"/>
+        </w:rPr>
+        <w:t xml:space="preserve"> tienen la capacidad de interrumpir el sentido de identidad y agencia de una persona. De </w:t>
+      </w:r>
+      <w:r>
+        <w:rPr>
+          <w:lang w:val="es-MX"/>
+        </w:rPr>
+        <w:t>esta forma</w:t>
+      </w:r>
+      <w:r>
+        <w:rPr>
+          <w:lang w:val="es-MX"/>
+        </w:rPr>
+        <w:t xml:space="preserve">, algunas personas recibiendo estimulación cerebral por electrodos reportan sentirse diferentes </w:t>
+      </w:r>
+      <w:r>
+        <w:rPr>
+          <w:lang w:val="es-MX"/>
+        </w:rPr>
+        <w:t>a lo que eran en un principio.</w:t>
+      </w:r>
+    </w:p>
+    <w:p>
+      <w:pPr>
+        <w:rPr>
+          <w:lang w:val="es-MX"/>
+        </w:rPr>
+      </w:pPr>
+      <w:proofErr w:type="spellStart"/>
+      <w:r>
+        <w:rPr>
+          <w:lang w:val="es-MX"/>
+        </w:rPr>
+        <w:t>iii</w:t>
+      </w:r>
+      <w:proofErr w:type="spellEnd"/>
+      <w:r>
+        <w:rPr>
+          <w:lang w:val="es-MX"/>
+        </w:rPr>
+        <w:t>. Mejora cerebral. Las personas podrían experimentar pres</w:t>
+      </w:r>
+      <w:r>
+        <w:rPr>
+          <w:lang w:val="es-MX"/>
+        </w:rPr>
+        <w:t xml:space="preserve">ión para adoptar mejoras </w:t>
+      </w:r>
+      <w:proofErr w:type="spellStart"/>
+      <w:r>
+        <w:rPr>
+          <w:lang w:val="es-MX"/>
+        </w:rPr>
+        <w:t>neuroteconologías</w:t>
+      </w:r>
+      <w:proofErr w:type="spellEnd"/>
+      <w:r>
+        <w:rPr>
+          <w:lang w:val="es-MX"/>
+        </w:rPr>
+        <w:t xml:space="preserve"> que les permitan expandir sus capacidades sensoriales o mentales. </w:t>
+      </w:r>
+      <w:r>
+        <w:rPr>
+          <w:lang w:val="es-MX"/>
+        </w:rPr>
+        <w:t xml:space="preserve">Asimismo, </w:t>
+      </w:r>
+      <w:r>
+        <w:rPr>
+          <w:lang w:val="es-MX"/>
+        </w:rPr>
+        <w:t>es posible imaginar un escenario donde se utilice</w:t>
+      </w:r>
+      <w:r>
+        <w:rPr>
+          <w:lang w:val="es-MX"/>
+        </w:rPr>
+        <w:t xml:space="preserve"> en la carrera armamentística para crear “agente super inteligentes”. </w:t>
+      </w:r>
+    </w:p>
+    <w:p>
+      <w:pPr>
+        <w:rPr>
+          <w:lang w:val="es-MX"/>
+        </w:rPr>
+      </w:pPr>
+      <w:proofErr w:type="spellStart"/>
+      <w:r>
+        <w:rPr>
+          <w:lang w:val="es-MX"/>
+        </w:rPr>
+        <w:t>iv</w:t>
+      </w:r>
+      <w:proofErr w:type="spellEnd"/>
+      <w:r>
+        <w:rPr>
+          <w:lang w:val="es-MX"/>
+        </w:rPr>
+        <w:t xml:space="preserve">. </w:t>
+      </w:r>
+      <w:proofErr w:type="spellStart"/>
+      <w:r>
+        <w:rPr>
+          <w:lang w:val="es-MX"/>
+        </w:rPr>
+        <w:t>Cesgo</w:t>
+      </w:r>
+      <w:proofErr w:type="spellEnd"/>
+      <w:r>
+        <w:rPr>
+          <w:lang w:val="es-MX"/>
+        </w:rPr>
+        <w:t xml:space="preserve">. Cuando una decisión tecnológica o científica está basada en un angosto conjunto de conceptos y normas, la tecnología resultante puede privilegiar </w:t>
+      </w:r>
+      <w:proofErr w:type="gramStart"/>
+      <w:r>
+        <w:rPr>
+          <w:lang w:val="es-MX"/>
+        </w:rPr>
+        <w:t>cierto grupos</w:t>
+      </w:r>
+      <w:proofErr w:type="gramEnd"/>
+      <w:r>
+        <w:rPr>
+          <w:lang w:val="es-MX"/>
+        </w:rPr>
+        <w:t xml:space="preserve"> y perjudicar a otros. Se urgen contramedidas para combatir el </w:t>
+      </w:r>
+      <w:r>
+        <w:rPr>
+          <w:lang w:val="es-MX"/>
+        </w:rPr>
+        <w:t xml:space="preserve">sesgo de sistemas </w:t>
+      </w:r>
+      <w:r>
+        <w:rPr>
+          <w:i/>
+          <w:iCs/>
+          <w:lang w:val="es-MX"/>
+        </w:rPr>
+        <w:t xml:space="preserve">machine </w:t>
+      </w:r>
+      <w:proofErr w:type="spellStart"/>
+      <w:r>
+        <w:rPr>
+          <w:i/>
+          <w:iCs/>
+          <w:lang w:val="es-MX"/>
+        </w:rPr>
+        <w:t>learning</w:t>
+      </w:r>
+      <w:proofErr w:type="spellEnd"/>
+      <w:r>
+        <w:rPr>
+          <w:lang w:val="es-MX"/>
+        </w:rPr>
+        <w:t>.</w:t>
+      </w:r>
+    </w:p>
+    <w:p>
+      <w:pPr>
+        <w:rPr>
+          <w:i/>
+          <w:iCs/>
+        </w:rPr>
+      </w:pPr>
+      <w:r>
+        <w:rPr>
+          <w:i/>
+          <w:iCs/>
+          <w:highlight w:val="yellow"/>
+        </w:rPr>
+        <w:t>Outright</w:t>
+      </w:r>
+      <w:r>
+        <w:rPr>
+          <w:i/>
+          <w:iCs/>
+          <w:highlight w:val="yellow"/>
+        </w:rPr>
+        <w:t xml:space="preserve"> </w:t>
+      </w:r>
+      <w:r>
+        <w:rPr>
+          <w:i/>
+          <w:iCs/>
+          <w:highlight w:val="yellow"/>
+        </w:rPr>
+        <w:t xml:space="preserve">bans </w:t>
+      </w:r>
+      <w:proofErr w:type="gramStart"/>
+      <w:r>
+        <w:rPr>
+          <w:i/>
+          <w:iCs/>
+          <w:highlight w:val="yellow"/>
+        </w:rPr>
+        <w:t>of</w:t>
+      </w:r>
+      <w:proofErr w:type="gramEnd"/>
+      <w:r>
+        <w:rPr>
+          <w:i/>
+          <w:iCs/>
+          <w:highlight w:val="yellow"/>
+        </w:rPr>
+        <w:t xml:space="preserve"> certain</w:t>
+      </w:r>
+      <w:r>
+        <w:rPr>
+          <w:i/>
+          <w:iCs/>
+          <w:highlight w:val="yellow"/>
+        </w:rPr>
+        <w:t xml:space="preserve"> </w:t>
+      </w:r>
+      <w:r>
+        <w:rPr>
+          <w:i/>
+          <w:iCs/>
+          <w:highlight w:val="yellow"/>
+        </w:rPr>
+        <w:t>technologies</w:t>
+      </w:r>
+      <w:r>
+        <w:rPr>
+          <w:i/>
+          <w:iCs/>
+          <w:highlight w:val="yellow"/>
+        </w:rPr>
+        <w:t xml:space="preserve"> </w:t>
+      </w:r>
+      <w:r>
+        <w:rPr>
+          <w:i/>
+          <w:iCs/>
+          <w:highlight w:val="yellow"/>
+        </w:rPr>
+        <w:t>could simply</w:t>
+      </w:r>
+      <w:r>
+        <w:rPr>
+          <w:i/>
+          <w:iCs/>
+          <w:highlight w:val="yellow"/>
+        </w:rPr>
+        <w:t xml:space="preserve"> </w:t>
+      </w:r>
+      <w:r>
+        <w:rPr>
+          <w:i/>
+          <w:iCs/>
+          <w:highlight w:val="yellow"/>
+        </w:rPr>
+        <w:t>push them</w:t>
+      </w:r>
+      <w:r>
+        <w:rPr>
+          <w:i/>
+          <w:iCs/>
+          <w:highlight w:val="yellow"/>
+        </w:rPr>
+        <w:t xml:space="preserve"> </w:t>
+      </w:r>
+      <w:r>
+        <w:rPr>
+          <w:i/>
+          <w:iCs/>
+          <w:highlight w:val="yellow"/>
+        </w:rPr>
+        <w:t>underground</w:t>
+      </w:r>
+      <w:r>
+        <w:rPr>
+          <w:i/>
+          <w:iCs/>
+        </w:rPr>
+        <w:t xml:space="preserve"> </w:t>
+      </w:r>
+    </w:p>
+    <w:p>
+      <w:pPr>
+        <w:rPr>
+          <w:lang w:val="es-MX"/>
+        </w:rPr>
+      </w:pPr>
+      <w:r>
+        <w:rPr>
+          <w:lang w:val="es-MX"/>
+        </w:rPr>
+        <w:t xml:space="preserve">Finalmente, </w:t>
+      </w:r>
+      <w:r>
+        <w:rPr>
+          <w:lang w:val="es-MX"/>
+        </w:rPr>
+        <w:t>Becerra (2025)</w:t>
+      </w:r>
+      <w:r>
+        <w:rPr>
+          <w:lang w:val="es-MX"/>
+        </w:rPr>
+        <w:t xml:space="preserve"> menciona que, e</w:t>
+      </w:r>
+      <w:r>
+        <w:rPr>
+          <w:lang w:val="es-MX"/>
+        </w:rPr>
+        <w:t xml:space="preserve">n la actualidad, son pocos los países en el mundo que tienen una regulación específica relacionada con la </w:t>
+      </w:r>
+      <w:proofErr w:type="spellStart"/>
+      <w:r>
+        <w:rPr>
+          <w:lang w:val="es-MX"/>
+        </w:rPr>
+        <w:t>neurotecnología</w:t>
+      </w:r>
+      <w:proofErr w:type="spellEnd"/>
+      <w:r>
+        <w:rPr>
+          <w:lang w:val="es-MX"/>
+        </w:rPr>
+        <w:t xml:space="preserve"> y son menos aquellos que cuentan con un marco normativo relacionado con los </w:t>
+      </w:r>
+      <w:proofErr w:type="spellStart"/>
+      <w:r>
+        <w:rPr>
+          <w:lang w:val="es-MX"/>
+        </w:rPr>
+        <w:t>neuroderecho</w:t>
+      </w:r>
+      <w:proofErr w:type="spellEnd"/>
+      <w:r>
+        <w:rPr>
+          <w:lang w:val="es-MX"/>
+        </w:rPr>
+        <w:t>.</w:t>
+      </w:r>
+    </w:p>
+    <w:p>
+      <w:pPr>
+        <w:rPr>
+          <w:lang w:val="es-MX"/>
+        </w:rPr>
+      </w:pPr>
+      <w:r>
+        <w:rPr>
+          <w:lang w:val="es-MX"/>
+        </w:rPr>
+        <w:t xml:space="preserve"> </w:t>
+      </w:r>
+    </w:p>
+    <w:p>
+      <w:pPr>
+        <w:rPr>
+          <w:lang w:val="es-MX"/>
+        </w:rPr>
+      </w:pPr>
+    </w:p>
+    <w:p>
+      <w:pPr>
+        <w:rPr>
+          <w:lang w:val="es-MX"/>
+        </w:rPr>
+      </w:pPr>
+    </w:p>
+    <w:p>
+      <w:pPr>
+        <w:rPr>
+          <w:lang w:val="es-MX"/>
+        </w:rPr>
+      </w:pPr>
+      <w:hyperlink r:id="rId10" w:history="1">
+        <w:r>
+          <w:rPr>
+            <w:rStyle w:val="Hyperlink"/>
+            <w:lang w:val="es-MX"/>
+          </w:rPr>
+          <w:t>https://globernance.org/wp-content/uploads/2020/04/20201008-Neuroderechos-_Derechos_....pdf</w:t>
+        </w:r>
+      </w:hyperlink>
+      <w:r>
+        <w:rPr>
+          <w:lang w:val="es-MX"/>
+        </w:rPr>
+        <w:t xml:space="preserve"> </w:t>
+      </w:r>
+      <w:r>
+        <w:rPr>
+          <w:lang w:val="es-MX"/>
+        </w:rPr>
+        <w:t xml:space="preserve"> </w:t>
+      </w:r>
+      <w:proofErr w:type="spellStart"/>
+      <w:r>
+        <w:rPr>
+          <w:lang w:val="es-MX"/>
+        </w:rPr>
+        <w:t>Ausí</w:t>
+      </w:r>
+      <w:r>
+        <w:rPr>
+          <w:lang w:val="es-MX"/>
+        </w:rPr>
+        <w:t>n</w:t>
+      </w:r>
+      <w:proofErr w:type="spellEnd"/>
+      <w:r>
+        <w:rPr>
+          <w:lang w:val="es-MX"/>
+        </w:rPr>
+        <w:t xml:space="preserve"> et al</w:t>
+      </w:r>
+      <w:r>
+        <w:rPr>
+          <w:lang w:val="es-MX"/>
+        </w:rPr>
+        <w:t xml:space="preserve"> (2020)</w:t>
+      </w:r>
+    </w:p>
+    <w:p>
+      <w:pPr>
+        <w:rPr>
+          <w:lang w:val="es-MX"/>
+        </w:rPr>
+      </w:pPr>
+      <w:hyperlink r:id="rId11" w:history="1">
+        <w:r>
+          <w:rPr>
+            <w:rStyle w:val="Hyperlink"/>
+            <w:lang w:val="es-MX"/>
+          </w:rPr>
+          <w:t>https://www.nature.com/articles/551159a</w:t>
+        </w:r>
+      </w:hyperlink>
+      <w:r>
+        <w:rPr>
+          <w:lang w:val="es-MX"/>
+        </w:rPr>
+        <w:t xml:space="preserve"> Yuste</w:t>
+      </w:r>
+      <w:r>
+        <w:rPr>
+          <w:lang w:val="es-MX"/>
+        </w:rPr>
+        <w:t xml:space="preserve"> (2017)</w:t>
+      </w:r>
+    </w:p>
+    <w:p>
+      <w:pPr>
         <w:rPr>
           <w:b/>
           <w:bCs/>
           <w:lang w:val="es-MX"/>
         </w:rPr>
-        <w:lastRenderedPageBreak/>
-        <w:t>NEURODERECHOS</w:t>
-      </w:r>
-    </w:p>
-    <w:p>
-      <w:pPr>
-        <w:rPr>
-          <w:lang w:val="es-MX"/>
-        </w:rPr>
-      </w:pPr>
-      <w:r>
-        <w:rPr>
-          <w:lang w:val="es-MX"/>
-        </w:rPr>
-        <w:t xml:space="preserve">El constante trabajo colaborativo de expertos en neuroética, bioeticistas, juristas, filósofos y neurocientíficos ha dado como resultado nuevas propuestas desde entonces. En el año 2019, Yuste crea la Neuro Rights Innitiative (NRI) que posteriormente otorga los insumos para que se creara, en el 2022 en la Universidad de Columbia en Nueva York, la fundación Neuro Rights con el objetivo </w:t>
-      </w:r>
-      <w:r>
-        <w:rPr>
-          <w:lang w:val="es-MX"/>
-        </w:rPr>
-        <w:t>de promover la innovación tecnológica protegiendo</w:t>
-      </w:r>
-      <w:r>
-        <w:rPr>
-          <w:lang w:val="es-MX"/>
-        </w:rPr>
-        <w:t xml:space="preserve"> los Derechos Humanos. Esta fundación estima que el </w:t>
-      </w:r>
-      <w:r>
-        <w:rPr>
-          <w:lang w:val="es-MX"/>
-        </w:rPr>
-        <w:t>mercado global de las neurotecnologías pasará de 15 mil</w:t>
-      </w:r>
-      <w:r>
-        <w:rPr>
-          <w:lang w:val="es-MX"/>
-        </w:rPr>
-        <w:t xml:space="preserve"> millones de dólares en el 2023, a 55 mil millones de dólares en el 2032; en otras palabras, cuadruplicará su valor en tan solo nueve años. Bajo esta iniciativa se propone la creación de cinco neuroderechos (22)</w:t>
-      </w:r>
-    </w:p>
-    <w:p>
-      <w:pPr>
-        <w:rPr>
-          <w:lang w:val="es-MX"/>
-        </w:rPr>
-      </w:pPr>
-      <w:r>
-        <w:rPr>
-          <w:lang w:val="es-MX"/>
-        </w:rPr>
-        <w:t xml:space="preserve">1. </w:t>
-      </w:r>
-      <w:r>
-        <w:rPr>
-          <w:lang w:val="es-MX"/>
-        </w:rPr>
-        <w:t>Derecho a la identidad personal</w:t>
-      </w:r>
-      <w:r>
-        <w:rPr>
-          <w:lang w:val="es-MX"/>
-        </w:rPr>
-        <w:t xml:space="preserve">:  </w:t>
-      </w:r>
-      <w:r>
-        <w:rPr>
-          <w:lang w:val="es-MX"/>
-        </w:rPr>
-        <w:t>establecimiento de</w:t>
-      </w:r>
-      <w:r>
-        <w:rPr>
-          <w:lang w:val="es-MX"/>
-        </w:rPr>
-        <w:t xml:space="preserve"> límites claros y estrictos para no permitir que la tecnología interrumpa el sentido ser de uno mismo, es decir, establecer límites entre la conciencia de una persona y los insumos tecnológicos externos, esto es, el derecho a no ser modificado sin el consentimiento explícito. Las BCI, especialmente las que permiten la escritura cerebral o la modulación neuronal, podrían, en teoría, influir o incluso modificar la percepción, la memoria o el estado de ánimo de una persona.</w:t>
-      </w:r>
-    </w:p>
-    <w:p>
-      <w:pPr>
-        <w:rPr>
-          <w:lang w:val="es-MX"/>
-        </w:rPr>
-      </w:pPr>
-      <w:r>
-        <w:rPr>
-          <w:lang w:val="es-MX"/>
-        </w:rPr>
-        <w:t xml:space="preserve">2. Derecho al libre albedrío: protección al control que </w:t>
-      </w:r>
-      <w:r>
-        <w:rPr>
-          <w:lang w:val="es-MX"/>
-        </w:rPr>
-        <w:t>una persona tiene sobre la toma de decisiones sin manipulación</w:t>
-      </w:r>
-      <w:r>
-        <w:rPr>
-          <w:lang w:val="es-MX"/>
-        </w:rPr>
-        <w:t xml:space="preserve"> por parte de estas neurotecnologías, como las BCI. Está íntimamente ligado al principio de autonomía: si una BCI es capaz de influir en nuestras intenciones o de inducir acciones, la noción de libre albedrío se vería comprometida. Este derecho salvaguarda la libertad de elección en su dimensión más íntima.</w:t>
-      </w:r>
-    </w:p>
-    <w:p>
-      <w:pPr>
-        <w:rPr>
-          <w:lang w:val="es-MX"/>
-        </w:rPr>
-      </w:pPr>
-      <w:r>
-        <w:rPr>
-          <w:lang w:val="es-MX"/>
-        </w:rPr>
-        <w:t xml:space="preserve">3. </w:t>
-      </w:r>
-      <w:r>
-        <w:rPr>
-          <w:lang w:val="es-MX"/>
-        </w:rPr>
-        <w:t>Derecho a la privacidad mental</w:t>
-      </w:r>
-      <w:r>
-        <w:rPr>
-          <w:lang w:val="es-MX"/>
-        </w:rPr>
-        <w:t xml:space="preserve">:  </w:t>
-      </w:r>
-      <w:r>
-        <w:rPr>
-          <w:lang w:val="es-MX"/>
-        </w:rPr>
-        <w:t>protección a los datos</w:t>
-      </w:r>
-      <w:r>
-        <w:rPr>
-          <w:lang w:val="es-MX"/>
-        </w:rPr>
-        <w:t xml:space="preserve"> neuronales como datos sensibles, incluyendo el derecho de eliminación de estos datos a petición de la persona, protección ante la posible venta, </w:t>
-      </w:r>
-      <w:r>
-        <w:rPr>
-          <w:lang w:val="es-MX"/>
-        </w:rPr>
-        <w:t>transferencia</w:t>
-      </w:r>
-      <w:r>
-        <w:rPr>
-          <w:lang w:val="es-MX"/>
-        </w:rPr>
-        <w:t xml:space="preserve"> comercial y estricta regulación sobre su uso.</w:t>
-      </w:r>
-    </w:p>
-    <w:p>
-      <w:pPr>
-        <w:rPr>
-          <w:lang w:val="es-MX"/>
-        </w:rPr>
-      </w:pPr>
-      <w:r>
-        <w:rPr>
-          <w:lang w:val="es-MX"/>
-        </w:rPr>
-        <w:t xml:space="preserve">4. Acceso equitativo al aumento mental o mejora </w:t>
-      </w:r>
-      <w:r>
-        <w:rPr>
-          <w:lang w:val="es-MX"/>
-        </w:rPr>
-        <w:t>cognitiva</w:t>
-      </w:r>
-      <w:r>
-        <w:rPr>
-          <w:lang w:val="es-MX"/>
-        </w:rPr>
-        <w:t xml:space="preserve">: establecimiento de directrices claras tanto a nivel nacional como internacional, que regulen el uso de neurotecnologías enfocadas en la mejora cognitiva, o enhancement, fundamentadas en los principios de </w:t>
-      </w:r>
-      <w:r>
-        <w:rPr>
-          <w:lang w:val="es-MX"/>
-        </w:rPr>
-        <w:t>justicia e igualdad, especialmente en su acceso</w:t>
-      </w:r>
-      <w:r>
-        <w:rPr>
-          <w:lang w:val="es-MX"/>
-        </w:rPr>
-        <w:t xml:space="preserve">.  </w:t>
-      </w:r>
-      <w:r>
-        <w:rPr>
-          <w:lang w:val="es-MX"/>
-        </w:rPr>
-        <w:t>Si las</w:t>
-      </w:r>
-      <w:r>
-        <w:rPr>
-          <w:lang w:val="es-MX"/>
-        </w:rPr>
-        <w:t xml:space="preserve"> BCI ofrecen beneficios terapéuticos o de mejora significativos, su acceso no puede convertirse en un privilegio exclusivo para unos pocos. Este derecho implicaría la obligación de los estados y de la </w:t>
-      </w:r>
-      <w:r>
-        <w:rPr>
-          <w:lang w:val="es-MX"/>
-        </w:rPr>
-        <w:t>comunidad</w:t>
-      </w:r>
-      <w:r>
-        <w:rPr>
-          <w:lang w:val="es-MX"/>
-        </w:rPr>
-        <w:t xml:space="preserve"> internacional de asegurar que estas tecnologías sean asequibles y accesibles para todos aquellos que </w:t>
-      </w:r>
-      <w:r>
-        <w:rPr>
-          <w:lang w:val="es-MX"/>
-        </w:rPr>
-        <w:t>las necesiten, evitando la creación de una brecha neurotecnológica</w:t>
-      </w:r>
-      <w:r>
-        <w:rPr>
-          <w:lang w:val="es-MX"/>
-        </w:rPr>
-        <w:t xml:space="preserve"> que profundice las desigualdades sociales y de salud.</w:t>
-      </w:r>
-    </w:p>
-    <w:p>
-      <w:pPr>
-        <w:rPr>
-          <w:lang w:val="es-MX"/>
-        </w:rPr>
-      </w:pPr>
-      <w:r>
-        <w:rPr>
-          <w:lang w:val="es-MX"/>
-        </w:rPr>
-        <w:lastRenderedPageBreak/>
-        <w:t xml:space="preserve">5. Protección contra el sesgo: dispone las medidas </w:t>
-      </w:r>
-      <w:r>
-        <w:rPr>
-          <w:lang w:val="es-MX"/>
-        </w:rPr>
-        <w:t>necesarias</w:t>
-      </w:r>
-      <w:r>
-        <w:rPr>
-          <w:lang w:val="es-MX"/>
-        </w:rPr>
-        <w:t xml:space="preserve"> para contrarrestar los sesgos en los algoritmos de las IA y las BCI. Los algoritmos que interpretan las señales cerebrales y que subyacen a las BCI son desarrollados por humanos, por lo tanto, pueden heredar o amplificar sesgos inconscientes. Actualmente, se han identificado múltiples sesgos en la información que alimenta los sistemas de IA, los cuales complementan las neurotecnologías, incluidas las BCI, por lo que podrían llevar a que la decodificación de la actividad cerebral sea errónea o sesgada para ciertos grupos demográficos o que las BCI funcionen de manera menos efectiva para ellos, generando nuevas formas de discriminación o exclusión</w:t>
+      </w:pPr>
+    </w:p>
+    <w:p>
+      <w:pPr>
+        <w:rPr>
+          <w:lang w:val="es-MX"/>
+        </w:rPr>
+      </w:pPr>
+      <w:r>
+        <w:rPr>
+          <w:i/>
+          <w:iCs/>
+          <w:lang w:val="es-MX"/>
+        </w:rPr>
+        <w:t>Habeas mentes</w:t>
       </w:r>
       <w:r>
         <w:rPr>
@@ -1120,34 +1533,6 @@
         </w:rPr>
         <w:t>.</w:t>
       </w:r>
-    </w:p>
-    <w:p>
-      <w:pPr>
-        <w:rPr>
-          <w:lang w:val="es-MX"/>
-        </w:rPr>
-      </w:pPr>
-      <w:r>
-        <w:rPr>
-          <w:i/>
-          <w:iCs/>
-          <w:lang w:val="es-MX"/>
-        </w:rPr>
-        <w:t>Habeas mentes</w:t>
-      </w:r>
-      <w:r>
-        <w:rPr>
-          <w:lang w:val="es-MX"/>
-        </w:rPr>
-        <w:t>.</w:t>
-      </w:r>
-    </w:p>
-    <w:p>
-      <w:pPr>
-        <w:rPr>
-          <w:lang w:val="es-MX"/>
-        </w:rPr>
-      </w:pPr>
     </w:p>
     <w:p>
       <w:pPr>
@@ -1157,66 +1542,22 @@
           <w:lang w:val="es-MX"/>
         </w:rPr>
       </w:pPr>
-      <w:r>
+    </w:p>
+    <w:p>
+      <w:pPr>
         <w:rPr>
           <w:b/>
           <w:bCs/>
           <w:lang w:val="es-MX"/>
         </w:rPr>
-        <w:t>AUSENCIA DE UN MARCO JURÍDICO ESPECÍFICO Y AVANCES</w:t>
-      </w:r>
-    </w:p>
-    <w:p>
-      <w:pPr>
-        <w:rPr>
-          <w:lang w:val="es-MX"/>
-        </w:rPr>
-      </w:pPr>
-      <w:r>
-        <w:rPr>
-          <w:lang w:val="es-MX"/>
-        </w:rPr>
-        <w:t>En la actualidad, son pocos los países en el mundo que tienen una regulación específica relacionada con la neurotecnología y son menos aquellos que cuentan con un marco normativo relacionado con los neuroderecho</w:t>
-      </w:r>
-    </w:p>
-    <w:p>
-      <w:pPr>
-        <w:rPr>
-          <w:lang w:val="es-MX"/>
-        </w:rPr>
-      </w:pPr>
-    </w:p>
-    <w:p>
-      <w:pPr>
+      </w:pPr>
+      <w:r>
         <w:rPr>
           <w:b/>
           <w:bCs/>
           <w:lang w:val="es-MX"/>
         </w:rPr>
-      </w:pPr>
-      <w:r>
-        <w:rPr>
-          <w:b/>
-          <w:bCs/>
-          <w:lang w:val="es-MX"/>
-        </w:rPr>
-        <w:t>BCI EN CONTEXTOS NO MÉDICOS: CONSIDERACIONES ÉTICAS PARA EL USO</w:t>
-      </w:r>
-      <w:r>
-        <w:rPr>
-          <w:b/>
-          <w:bCs/>
-          <w:lang w:val="es-MX"/>
-        </w:rPr>
-        <w:t xml:space="preserve"> </w:t>
-      </w:r>
-      <w:r>
-        <w:rPr>
-          <w:b/>
-          <w:bCs/>
-          <w:lang w:val="es-MX"/>
-        </w:rPr>
-        <w:t>RECREATIVO, MILITAR O COMERCIAL DE LAS BC</w:t>
+        <w:t>BCI EN CONTEXTOS NO MÉDICOS: CONSIDERACIONES ÉTICAS PARA EL USO RECREATIVO, MILITAR O COMERCIAL DE LAS BC</w:t>
       </w:r>
     </w:p>
     <w:p>

</xml_diff>

<commit_message>
Actualiza presentación del informe (2 nuevas slides) y capítulos de redes neuronales y desafíos éticos
</commit_message>
<xml_diff>
--- a/DESAFÍOS ÉTICOS.docx
+++ b/DESAFÍOS ÉTICOS.docx
@@ -125,7 +125,20 @@
         <w:rPr>
           <w:lang w:val="es-MX"/>
         </w:rPr>
-        <w:t xml:space="preserve">. En primer lugar, el principio de la autonomía. </w:t>
+        <w:t>:</w:t>
+      </w:r>
+    </w:p>
+    <w:p>
+      <w:pPr>
+        <w:rPr>
+          <w:lang w:val="es-MX"/>
+        </w:rPr>
+      </w:pPr>
+      <w:r>
+        <w:rPr>
+          <w:lang w:val="es-MX"/>
+        </w:rPr>
+        <w:t xml:space="preserve">En primer lugar, el principio de la autonomía. </w:t>
       </w:r>
       <w:r>
         <w:rPr>
@@ -205,28 +218,6 @@
         </w:rPr>
         <w:t xml:space="preserve">a. </w:t>
       </w:r>
-    </w:p>
-    <w:p>
-      <w:pPr>
-        <w:rPr>
-          <w:lang w:val="es-MX"/>
-        </w:rPr>
-      </w:pPr>
-    </w:p>
-    <w:p>
-      <w:pPr>
-        <w:rPr>
-          <w:lang w:val="es-MX"/>
-        </w:rPr>
-      </w:pPr>
-      <w:r>
-        <w:rPr>
-          <w:b/>
-          <w:bCs/>
-          <w:lang w:val="es-MX"/>
-        </w:rPr>
-        <w:t>MACÍA (2026):</w:t>
-      </w:r>
       <w:r>
         <w:rPr>
           <w:lang w:val="es-MX"/>
@@ -237,57 +228,26 @@
         <w:rPr>
           <w:lang w:val="es-MX"/>
         </w:rPr>
-        <w:t xml:space="preserve">Una técnica, por ejemplo, de estimulación neuronal profunda para tratar el  comportamiento  obsesivo  compulsivo  limitará  los  impulsos  del  paciente,  produciendo una </w:t>
-      </w:r>
-      <w:r>
-        <w:rPr>
-          <w:lang w:val="es-MX"/>
-        </w:rPr>
-        <w:t>injerencia en</w:t>
-      </w:r>
-      <w:r>
-        <w:rPr>
-          <w:lang w:val="es-MX"/>
-        </w:rPr>
-        <w:t xml:space="preserve">  su  libertad  de  pensamiento;  la  implantación  de  un  dispositivo  de  interfaz cerebro computadora a un paciente con parálisis puede alterar su personalidad, distorsionar su sentido del yo y su sentimiento de agencia; una resonancia magnética funcional permite extraer un  amplio  volumen  de  los  procesos  neuronales  que  proporcionan  una  importante  información que puede acercar a conocer aspectos íntimos del </w:t>
-      </w:r>
-      <w:r>
-        <w:rPr>
-          <w:lang w:val="es-MX"/>
-        </w:rPr>
-        <w:t>paciente; y</w:t>
-      </w:r>
-      <w:r>
-        <w:rPr>
-          <w:lang w:val="es-MX"/>
-        </w:rPr>
-        <w:t xml:space="preserve"> así sucesivamente.</w:t>
-      </w:r>
-    </w:p>
-    <w:p>
-      <w:pPr>
-        <w:rPr>
-          <w:lang w:val="es-MX"/>
-        </w:rPr>
-      </w:pPr>
-    </w:p>
-    <w:p>
-      <w:pPr>
-        <w:rPr>
-          <w:lang w:val="es-MX"/>
-        </w:rPr>
-      </w:pPr>
-      <w:r>
-        <w:rPr>
-          <w:lang w:val="es-MX"/>
-        </w:rPr>
         <w:t xml:space="preserve">Además, es incierta la situación a que se presente a un paciente </w:t>
       </w:r>
       <w:r>
         <w:rPr>
           <w:lang w:val="es-MX"/>
         </w:rPr>
-        <w:t xml:space="preserve">con una enfermedad que merme su capacidad de consentimiento pleno o sea influenciado por las expectativas de seres queridos. En segundo lugar, el principio de beneficencia. La aplicación de estos dispositivos no se encuentra libre de riesgos inherentes </w:t>
+        <w:t>con una enfermedad que merme su capacidad de consentimiento pleno o sea influenciado por las expectativas de seres queridos.</w:t>
+      </w:r>
+    </w:p>
+    <w:p>
+      <w:pPr>
+        <w:rPr>
+          <w:lang w:val="es-MX"/>
+        </w:rPr>
+      </w:pPr>
+      <w:r>
+        <w:rPr>
+          <w:lang w:val="es-MX"/>
+        </w:rPr>
+        <w:t xml:space="preserve">En segundo lugar, el principio de beneficencia. La aplicación de estos dispositivos no se encuentra libre de riesgos inherentes </w:t>
       </w:r>
       <w:r>
         <w:rPr>
@@ -395,8 +355,15 @@
         <w:rPr>
           <w:lang w:val="es-MX"/>
         </w:rPr>
-        <w:t xml:space="preserve">. </w:t>
-      </w:r>
+        <w:t>.</w:t>
+      </w:r>
+    </w:p>
+    <w:p>
+      <w:pPr>
+        <w:rPr>
+          <w:lang w:val="es-MX"/>
+        </w:rPr>
+      </w:pPr>
       <w:r>
         <w:rPr>
           <w:lang w:val="es-MX"/>
@@ -413,14 +380,7 @@
         <w:rPr>
           <w:lang w:val="es-MX"/>
         </w:rPr>
-        <w:t xml:space="preserve">Este principio pone en tela de juicio la posible accesibilidad que tenga este tipo de tecnología y evitar exacerbar brechas médicas ya existentes. Entre centros de investigación privados y pacientes con los recursos </w:t>
-      </w:r>
-      <w:r>
-        <w:rPr>
-          <w:lang w:val="es-MX"/>
-        </w:rPr>
-        <w:lastRenderedPageBreak/>
-        <w:t xml:space="preserve">económicos para permitírselos, </w:t>
+        <w:t xml:space="preserve">Este principio pone en tela de juicio la posible accesibilidad que tenga este tipo de tecnología y evitar exacerbar brechas médicas ya existentes. Entre centros de investigación privados y pacientes con los recursos económicos para permitírselos, </w:t>
       </w:r>
       <w:r>
         <w:rPr>
@@ -769,11 +729,15 @@
     <w:p>
       <w:pPr>
         <w:rPr>
-          <w:lang w:val="es-MX"/>
-        </w:rPr>
-      </w:pPr>
-      <w:r>
-        <w:rPr>
+          <w:b/>
+          <w:bCs/>
+          <w:lang w:val="es-MX"/>
+        </w:rPr>
+      </w:pPr>
+      <w:r>
+        <w:rPr>
+          <w:b/>
+          <w:bCs/>
           <w:lang w:val="es-MX"/>
         </w:rPr>
         <w:lastRenderedPageBreak/>
@@ -870,13 +834,7 @@
         <w:rPr>
           <w:lang w:val="es-MX"/>
         </w:rPr>
-        <w:t>Yuste</w:t>
-      </w:r>
-      <w:r>
-        <w:rPr>
-          <w:lang w:val="es-MX"/>
-        </w:rPr>
-        <w:t xml:space="preserve"> (2017) define cuatro preocupaciones con r</w:t>
+        <w:t>Yuste (2017) define cuatro preocupaciones con r</w:t>
       </w:r>
       <w:r>
         <w:rPr>
@@ -897,25 +855,6 @@
           <w:lang w:val="es-MX"/>
         </w:rPr>
         <w:t xml:space="preserve"> emergentes:</w:t>
-      </w:r>
-    </w:p>
-    <w:p>
-      <w:pPr>
-        <w:rPr>
-          <w:lang w:val="es-MX"/>
-        </w:rPr>
-      </w:pPr>
-      <w:r>
-        <w:rPr>
-          <w:lang w:val="es-MX"/>
-        </w:rPr>
-        <w:t xml:space="preserve">i. Privacidad y consentimiento. Una extraordinaria cantidad de información personal puede ser obtenido </w:t>
-      </w:r>
-      <w:r>
-        <w:rPr>
-          <w:lang w:val="es-MX"/>
-        </w:rPr>
-        <w:t>a partir de los rastros de datos de las personas; por ello, se cree que los ciudadanos deben tener el derecho de mantener sus datos neuronales privados. Esta información puede ser susceptible a seguimiento o incluso manipulación por parte de corporaciones, hackers o agencias gubernamentales.</w:t>
       </w:r>
     </w:p>
     <w:p>
@@ -927,411 +866,232 @@
       </w:pPr>
       <w:r>
         <w:rPr>
+          <w:lang w:val="es-MX"/>
+        </w:rPr>
+        <w:t xml:space="preserve">i. Privacidad y consentimiento. Una extraordinaria cantidad de información personal puede ser obtenido </w:t>
+      </w:r>
+      <w:r>
+        <w:rPr>
+          <w:lang w:val="es-MX"/>
+        </w:rPr>
+        <w:t>a partir de los rastros de datos de las personas; por ello, se cree que los ciudadanos deben tener el derecho de mantener sus datos neuronales privados. Esta información puede ser susceptible a seguimiento o incluso manipulación por parte de corporaciones, hackers o agencias gubernamentales.</w:t>
+      </w:r>
+    </w:p>
+    <w:p>
+      <w:pPr>
+        <w:rPr>
+          <w:lang w:val="es-MX"/>
+        </w:rPr>
+      </w:pPr>
+      <w:proofErr w:type="spellStart"/>
+      <w:r>
+        <w:rPr>
+          <w:lang w:val="es-MX"/>
+        </w:rPr>
+        <w:t>ii</w:t>
+      </w:r>
+      <w:proofErr w:type="spellEnd"/>
+      <w:r>
+        <w:rPr>
+          <w:lang w:val="es-MX"/>
+        </w:rPr>
+        <w:t xml:space="preserve">. Agencia y </w:t>
+      </w:r>
+      <w:r>
+        <w:rPr>
+          <w:lang w:val="es-MX"/>
+        </w:rPr>
+        <w:t>identidad</w:t>
+      </w:r>
+      <w:r>
+        <w:rPr>
+          <w:lang w:val="es-MX"/>
+        </w:rPr>
+        <w:t>.  L</w:t>
+      </w:r>
+      <w:r>
+        <w:rPr>
+          <w:lang w:val="es-MX"/>
+        </w:rPr>
+        <w:t xml:space="preserve">as </w:t>
+      </w:r>
+      <w:proofErr w:type="spellStart"/>
+      <w:r>
+        <w:rPr>
+          <w:lang w:val="es-MX"/>
+        </w:rPr>
+        <w:t>neurotecnologías</w:t>
+      </w:r>
+      <w:proofErr w:type="spellEnd"/>
+      <w:r>
+        <w:rPr>
+          <w:lang w:val="es-MX"/>
+        </w:rPr>
+        <w:t xml:space="preserve"> tienen la capacidad de interrumpir el sentido de identidad y agencia de una persona. De </w:t>
+      </w:r>
+      <w:r>
+        <w:rPr>
+          <w:lang w:val="es-MX"/>
+        </w:rPr>
+        <w:t>esta forma</w:t>
+      </w:r>
+      <w:r>
+        <w:rPr>
+          <w:lang w:val="es-MX"/>
+        </w:rPr>
+        <w:t xml:space="preserve">, algunas personas recibiendo estimulación cerebral por electrodos reportan sentirse diferentes </w:t>
+      </w:r>
+      <w:r>
+        <w:rPr>
+          <w:lang w:val="es-MX"/>
+        </w:rPr>
+        <w:t>a lo que eran en un principio.</w:t>
+      </w:r>
+    </w:p>
+    <w:p>
+      <w:pPr>
+        <w:rPr>
+          <w:lang w:val="es-MX"/>
+        </w:rPr>
+      </w:pPr>
+      <w:proofErr w:type="spellStart"/>
+      <w:r>
+        <w:rPr>
+          <w:lang w:val="es-MX"/>
+        </w:rPr>
+        <w:t>iii</w:t>
+      </w:r>
+      <w:proofErr w:type="spellEnd"/>
+      <w:r>
+        <w:rPr>
+          <w:lang w:val="es-MX"/>
+        </w:rPr>
+        <w:t>. Mejora cerebral. Las personas podrían experimentar pres</w:t>
+      </w:r>
+      <w:r>
+        <w:rPr>
+          <w:lang w:val="es-MX"/>
+        </w:rPr>
+        <w:t xml:space="preserve">ión para adoptar mejoras </w:t>
+      </w:r>
+      <w:proofErr w:type="spellStart"/>
+      <w:r>
+        <w:rPr>
+          <w:lang w:val="es-MX"/>
+        </w:rPr>
+        <w:t>neuroteconologías</w:t>
+      </w:r>
+      <w:proofErr w:type="spellEnd"/>
+      <w:r>
+        <w:rPr>
+          <w:lang w:val="es-MX"/>
+        </w:rPr>
+        <w:t xml:space="preserve"> que les permitan expandir sus capacidades sensoriales o mentales. </w:t>
+      </w:r>
+      <w:r>
+        <w:rPr>
+          <w:lang w:val="es-MX"/>
+        </w:rPr>
+        <w:t xml:space="preserve">Asimismo, </w:t>
+      </w:r>
+      <w:r>
+        <w:rPr>
+          <w:lang w:val="es-MX"/>
+        </w:rPr>
+        <w:t>es posible imaginar un escenario donde se utilice</w:t>
+      </w:r>
+      <w:r>
+        <w:rPr>
+          <w:lang w:val="es-MX"/>
+        </w:rPr>
+        <w:t xml:space="preserve"> en la carrera armamentística para crear “agente super inteligentes”. </w:t>
+      </w:r>
+    </w:p>
+    <w:p>
+      <w:pPr>
+        <w:rPr>
           <w:i/>
           <w:iCs/>
-          <w:highlight w:val="yellow"/>
-        </w:rPr>
-        <w:t>Algorithms that are used to target advertising, calculate insurance premiums or</w:t>
+          <w:lang w:val="es-MX"/>
+        </w:rPr>
+      </w:pPr>
+      <w:proofErr w:type="spellStart"/>
+      <w:r>
+        <w:rPr>
+          <w:lang w:val="es-MX"/>
+        </w:rPr>
+        <w:t>iv</w:t>
+      </w:r>
+      <w:proofErr w:type="spellEnd"/>
+      <w:r>
+        <w:rPr>
+          <w:lang w:val="es-MX"/>
+        </w:rPr>
+        <w:t xml:space="preserve">. </w:t>
+      </w:r>
+      <w:proofErr w:type="spellStart"/>
+      <w:r>
+        <w:rPr>
+          <w:lang w:val="es-MX"/>
+        </w:rPr>
+        <w:t>Cesgo</w:t>
+      </w:r>
+      <w:proofErr w:type="spellEnd"/>
+      <w:r>
+        <w:rPr>
+          <w:lang w:val="es-MX"/>
+        </w:rPr>
+        <w:t xml:space="preserve">. Cuando una decisión tecnológica o científica está basada en un angosto conjunto de conceptos y normas, la tecnología resultante puede privilegiar </w:t>
+      </w:r>
+      <w:proofErr w:type="gramStart"/>
+      <w:r>
+        <w:rPr>
+          <w:lang w:val="es-MX"/>
+        </w:rPr>
+        <w:t>cierto grupos</w:t>
+      </w:r>
+      <w:proofErr w:type="gramEnd"/>
+      <w:r>
+        <w:rPr>
+          <w:lang w:val="es-MX"/>
+        </w:rPr>
+        <w:t xml:space="preserve"> y perjudicar a otros. Se urgen contramedidas para combatir el </w:t>
+      </w:r>
+      <w:r>
+        <w:rPr>
+          <w:lang w:val="es-MX"/>
+        </w:rPr>
+        <w:t xml:space="preserve">sesgo de sistemas </w:t>
       </w:r>
       <w:r>
         <w:rPr>
           <w:i/>
           <w:iCs/>
-          <w:highlight w:val="yellow"/>
-        </w:rPr>
-        <w:t xml:space="preserve"> </w:t>
-      </w:r>
+          <w:lang w:val="es-MX"/>
+        </w:rPr>
+        <w:t xml:space="preserve">machine </w:t>
+      </w:r>
+      <w:proofErr w:type="spellStart"/>
       <w:r>
         <w:rPr>
           <w:i/>
           <w:iCs/>
-          <w:highlight w:val="yellow"/>
-        </w:rPr>
-        <w:t>match potential</w:t>
+          <w:lang w:val="es-MX"/>
+        </w:rPr>
+        <w:t>learning</w:t>
+      </w:r>
+      <w:proofErr w:type="spellEnd"/>
+      <w:r>
+        <w:rPr>
+          <w:lang w:val="es-MX"/>
+        </w:rPr>
+        <w:t>.</w:t>
       </w:r>
       <w:r>
         <w:rPr>
           <w:i/>
           <w:iCs/>
-          <w:highlight w:val="yellow"/>
-        </w:rPr>
-        <w:t xml:space="preserve"> </w:t>
-      </w:r>
-      <w:r>
-        <w:rPr>
-          <w:i/>
-          <w:iCs/>
-          <w:highlight w:val="yellow"/>
-        </w:rPr>
-        <w:t>partners will be</w:t>
-      </w:r>
-      <w:r>
-        <w:rPr>
-          <w:i/>
-          <w:iCs/>
-          <w:highlight w:val="yellow"/>
-        </w:rPr>
-        <w:t xml:space="preserve"> </w:t>
-      </w:r>
-      <w:r>
-        <w:rPr>
-          <w:i/>
-          <w:iCs/>
-          <w:highlight w:val="yellow"/>
-        </w:rPr>
-        <w:t>considerably more</w:t>
-      </w:r>
-      <w:r>
-        <w:rPr>
-          <w:i/>
-          <w:iCs/>
-          <w:highlight w:val="yellow"/>
-        </w:rPr>
-        <w:t xml:space="preserve"> </w:t>
-      </w:r>
-      <w:r>
-        <w:rPr>
-          <w:i/>
-          <w:iCs/>
-          <w:highlight w:val="yellow"/>
-        </w:rPr>
-        <w:t>powerf</w:t>
-      </w:r>
-      <w:r>
-        <w:rPr>
-          <w:i/>
-          <w:iCs/>
-          <w:highlight w:val="yellow"/>
-        </w:rPr>
-        <w:t>ul</w:t>
-      </w:r>
-    </w:p>
-    <w:p>
-      <w:pPr>
-        <w:rPr>
-          <w:lang w:val="es-MX"/>
-        </w:rPr>
-      </w:pPr>
-      <w:proofErr w:type="spellStart"/>
-      <w:r>
-        <w:rPr>
-          <w:lang w:val="es-MX"/>
-        </w:rPr>
-        <w:t>ii</w:t>
-      </w:r>
-      <w:proofErr w:type="spellEnd"/>
-      <w:r>
-        <w:rPr>
-          <w:lang w:val="es-MX"/>
-        </w:rPr>
-        <w:t xml:space="preserve">. Agencia y </w:t>
-      </w:r>
-      <w:r>
-        <w:rPr>
-          <w:lang w:val="es-MX"/>
-        </w:rPr>
-        <w:t>identidad</w:t>
-      </w:r>
-      <w:r>
-        <w:rPr>
-          <w:lang w:val="es-MX"/>
-        </w:rPr>
-        <w:t>.  L</w:t>
-      </w:r>
-      <w:r>
-        <w:rPr>
-          <w:lang w:val="es-MX"/>
-        </w:rPr>
-        <w:t xml:space="preserve">as </w:t>
-      </w:r>
-      <w:proofErr w:type="spellStart"/>
-      <w:r>
-        <w:rPr>
-          <w:lang w:val="es-MX"/>
-        </w:rPr>
-        <w:t>neurotecnologías</w:t>
-      </w:r>
-      <w:proofErr w:type="spellEnd"/>
-      <w:r>
-        <w:rPr>
-          <w:lang w:val="es-MX"/>
-        </w:rPr>
-        <w:t xml:space="preserve"> tienen la capacidad de interrumpir el sentido de identidad y agencia de una persona. De </w:t>
-      </w:r>
-      <w:r>
-        <w:rPr>
-          <w:lang w:val="es-MX"/>
-        </w:rPr>
-        <w:t>esta forma</w:t>
-      </w:r>
-      <w:r>
-        <w:rPr>
-          <w:lang w:val="es-MX"/>
-        </w:rPr>
-        <w:t xml:space="preserve">, algunas personas recibiendo estimulación cerebral por electrodos reportan sentirse diferentes </w:t>
-      </w:r>
-      <w:r>
-        <w:rPr>
-          <w:lang w:val="es-MX"/>
-        </w:rPr>
-        <w:t>a lo que eran en un principio.</w:t>
-      </w:r>
-    </w:p>
-    <w:p>
-      <w:pPr>
-        <w:rPr>
-          <w:lang w:val="es-MX"/>
-        </w:rPr>
-      </w:pPr>
-      <w:proofErr w:type="spellStart"/>
-      <w:r>
-        <w:rPr>
-          <w:lang w:val="es-MX"/>
-        </w:rPr>
-        <w:t>iii</w:t>
-      </w:r>
-      <w:proofErr w:type="spellEnd"/>
-      <w:r>
-        <w:rPr>
-          <w:lang w:val="es-MX"/>
-        </w:rPr>
-        <w:t>. Mejora cerebral. Las personas podrían experimentar pres</w:t>
-      </w:r>
-      <w:r>
-        <w:rPr>
-          <w:lang w:val="es-MX"/>
-        </w:rPr>
-        <w:t xml:space="preserve">ión para adoptar mejoras </w:t>
-      </w:r>
-      <w:proofErr w:type="spellStart"/>
-      <w:r>
-        <w:rPr>
-          <w:lang w:val="es-MX"/>
-        </w:rPr>
-        <w:t>neuroteconologías</w:t>
-      </w:r>
-      <w:proofErr w:type="spellEnd"/>
-      <w:r>
-        <w:rPr>
-          <w:lang w:val="es-MX"/>
-        </w:rPr>
-        <w:t xml:space="preserve"> que les permitan expandir sus capacidades sensoriales o mentales. </w:t>
-      </w:r>
-      <w:r>
-        <w:rPr>
-          <w:lang w:val="es-MX"/>
-        </w:rPr>
-        <w:t xml:space="preserve">Asimismo, </w:t>
-      </w:r>
-      <w:r>
-        <w:rPr>
-          <w:lang w:val="es-MX"/>
-        </w:rPr>
-        <w:t>es posible imaginar un escenario donde se utilice</w:t>
-      </w:r>
-      <w:r>
-        <w:rPr>
-          <w:lang w:val="es-MX"/>
-        </w:rPr>
-        <w:t xml:space="preserve"> en la carrera armamentística para crear “agente super inteligentes”. </w:t>
-      </w:r>
-    </w:p>
-    <w:p>
-      <w:pPr>
-        <w:rPr>
-          <w:lang w:val="es-MX"/>
-        </w:rPr>
-      </w:pPr>
-      <w:proofErr w:type="spellStart"/>
-      <w:r>
-        <w:rPr>
-          <w:lang w:val="es-MX"/>
-        </w:rPr>
-        <w:t>iv</w:t>
-      </w:r>
-      <w:proofErr w:type="spellEnd"/>
-      <w:r>
-        <w:rPr>
-          <w:lang w:val="es-MX"/>
-        </w:rPr>
-        <w:t xml:space="preserve">. </w:t>
-      </w:r>
-      <w:proofErr w:type="spellStart"/>
-      <w:r>
-        <w:rPr>
-          <w:lang w:val="es-MX"/>
-        </w:rPr>
-        <w:t>Cesgo</w:t>
-      </w:r>
-      <w:proofErr w:type="spellEnd"/>
-      <w:r>
-        <w:rPr>
-          <w:lang w:val="es-MX"/>
-        </w:rPr>
-        <w:t xml:space="preserve">. Cuando una decisión tecnológica o científica está basada en un angosto conjunto de conceptos y normas, la tecnología resultante puede privilegiar </w:t>
-      </w:r>
-      <w:proofErr w:type="gramStart"/>
-      <w:r>
-        <w:rPr>
-          <w:lang w:val="es-MX"/>
-        </w:rPr>
-        <w:t>cierto grupos</w:t>
-      </w:r>
-      <w:proofErr w:type="gramEnd"/>
-      <w:r>
-        <w:rPr>
-          <w:lang w:val="es-MX"/>
-        </w:rPr>
-        <w:t xml:space="preserve"> y perjudicar a otros. Se urgen contramedidas para combatir el </w:t>
-      </w:r>
-      <w:r>
-        <w:rPr>
-          <w:lang w:val="es-MX"/>
-        </w:rPr>
-        <w:t xml:space="preserve">sesgo de sistemas </w:t>
-      </w:r>
-      <w:r>
-        <w:rPr>
-          <w:i/>
-          <w:iCs/>
-          <w:lang w:val="es-MX"/>
-        </w:rPr>
-        <w:t xml:space="preserve">machine </w:t>
-      </w:r>
-      <w:proofErr w:type="spellStart"/>
-      <w:r>
-        <w:rPr>
-          <w:i/>
-          <w:iCs/>
-          <w:lang w:val="es-MX"/>
-        </w:rPr>
-        <w:t>learning</w:t>
-      </w:r>
-      <w:proofErr w:type="spellEnd"/>
-      <w:r>
-        <w:rPr>
-          <w:lang w:val="es-MX"/>
-        </w:rPr>
-        <w:t>.</w:t>
-      </w:r>
-    </w:p>
-    <w:p>
-      <w:pPr>
-        <w:rPr>
-          <w:i/>
-          <w:iCs/>
-        </w:rPr>
-      </w:pPr>
-      <w:r>
-        <w:rPr>
-          <w:i/>
-          <w:iCs/>
-          <w:highlight w:val="yellow"/>
-        </w:rPr>
-        <w:t>Outright</w:t>
-      </w:r>
-      <w:r>
-        <w:rPr>
-          <w:i/>
-          <w:iCs/>
-          <w:highlight w:val="yellow"/>
-        </w:rPr>
-        <w:t xml:space="preserve"> </w:t>
-      </w:r>
-      <w:r>
-        <w:rPr>
-          <w:i/>
-          <w:iCs/>
-          <w:highlight w:val="yellow"/>
-        </w:rPr>
-        <w:t xml:space="preserve">bans </w:t>
-      </w:r>
-      <w:proofErr w:type="gramStart"/>
-      <w:r>
-        <w:rPr>
-          <w:i/>
-          <w:iCs/>
-          <w:highlight w:val="yellow"/>
-        </w:rPr>
-        <w:t>of</w:t>
-      </w:r>
-      <w:proofErr w:type="gramEnd"/>
-      <w:r>
-        <w:rPr>
-          <w:i/>
-          <w:iCs/>
-          <w:highlight w:val="yellow"/>
-        </w:rPr>
-        <w:t xml:space="preserve"> certain</w:t>
-      </w:r>
-      <w:r>
-        <w:rPr>
-          <w:i/>
-          <w:iCs/>
-          <w:highlight w:val="yellow"/>
-        </w:rPr>
-        <w:t xml:space="preserve"> </w:t>
-      </w:r>
-      <w:r>
-        <w:rPr>
-          <w:i/>
-          <w:iCs/>
-          <w:highlight w:val="yellow"/>
-        </w:rPr>
-        <w:t>technologies</w:t>
-      </w:r>
-      <w:r>
-        <w:rPr>
-          <w:i/>
-          <w:iCs/>
-          <w:highlight w:val="yellow"/>
-        </w:rPr>
-        <w:t xml:space="preserve"> </w:t>
-      </w:r>
-      <w:r>
-        <w:rPr>
-          <w:i/>
-          <w:iCs/>
-          <w:highlight w:val="yellow"/>
-        </w:rPr>
-        <w:t>could simply</w:t>
-      </w:r>
-      <w:r>
-        <w:rPr>
-          <w:i/>
-          <w:iCs/>
-          <w:highlight w:val="yellow"/>
-        </w:rPr>
-        <w:t xml:space="preserve"> </w:t>
-      </w:r>
-      <w:r>
-        <w:rPr>
-          <w:i/>
-          <w:iCs/>
-          <w:highlight w:val="yellow"/>
-        </w:rPr>
-        <w:t>push them</w:t>
-      </w:r>
-      <w:r>
-        <w:rPr>
-          <w:i/>
-          <w:iCs/>
-          <w:highlight w:val="yellow"/>
-        </w:rPr>
-        <w:t xml:space="preserve"> </w:t>
-      </w:r>
-      <w:r>
-        <w:rPr>
-          <w:i/>
-          <w:iCs/>
-          <w:highlight w:val="yellow"/>
-        </w:rPr>
-        <w:t>underground</w:t>
-      </w:r>
-      <w:r>
-        <w:rPr>
-          <w:i/>
-          <w:iCs/>
+          <w:lang w:val="es-MX"/>
         </w:rPr>
         <w:t xml:space="preserve"> </w:t>
       </w:r>
@@ -1503,69 +1263,6 @@
         </w:rPr>
         <w:t xml:space="preserve"> (2017)</w:t>
       </w:r>
-    </w:p>
-    <w:p>
-      <w:pPr>
-        <w:rPr>
-          <w:b/>
-          <w:bCs/>
-          <w:lang w:val="es-MX"/>
-        </w:rPr>
-      </w:pPr>
-    </w:p>
-    <w:p>
-      <w:pPr>
-        <w:rPr>
-          <w:lang w:val="es-MX"/>
-        </w:rPr>
-      </w:pPr>
-      <w:r>
-        <w:rPr>
-          <w:i/>
-          <w:iCs/>
-          <w:lang w:val="es-MX"/>
-        </w:rPr>
-        <w:t>Habeas mentes</w:t>
-      </w:r>
-      <w:r>
-        <w:rPr>
-          <w:lang w:val="es-MX"/>
-        </w:rPr>
-        <w:t>.</w:t>
-      </w:r>
-    </w:p>
-    <w:p>
-      <w:pPr>
-        <w:rPr>
-          <w:b/>
-          <w:bCs/>
-          <w:lang w:val="es-MX"/>
-        </w:rPr>
-      </w:pPr>
-    </w:p>
-    <w:p>
-      <w:pPr>
-        <w:rPr>
-          <w:b/>
-          <w:bCs/>
-          <w:lang w:val="es-MX"/>
-        </w:rPr>
-      </w:pPr>
-      <w:r>
-        <w:rPr>
-          <w:b/>
-          <w:bCs/>
-          <w:lang w:val="es-MX"/>
-        </w:rPr>
-        <w:t>BCI EN CONTEXTOS NO MÉDICOS: CONSIDERACIONES ÉTICAS PARA EL USO RECREATIVO, MILITAR O COMERCIAL DE LAS BC</w:t>
-      </w:r>
-    </w:p>
-    <w:p>
-      <w:pPr>
-        <w:rPr>
-          <w:lang w:val="es-MX"/>
-        </w:rPr>
-      </w:pPr>
     </w:p>
     <w:sectPr>
       <w:pgSz w:w="12240" w:h="15840"/>
@@ -2180,6 +1877,7 @@
   <w:style w:type="character" w:default="1" w:styleId="DefaultParagraphFont">
     <w:name w:val="Default Paragraph Font"/>
     <w:uiPriority w:val="1"/>
+    <w:semiHidden/>
     <w:unhideWhenUsed/>
   </w:style>
   <w:style w:type="table" w:default="1" w:styleId="TableNormal">

</xml_diff>